<commit_message>
chore: 작업 자동 저장 (2026-08-20 11:24)
</commit_message>
<xml_diff>
--- a/docs/government-project/08_테스트결과서.docx
+++ b/docs/government-project/08_테스트결과서.docx
@@ -5968,7 +5968,7 @@
                 <w:sz w:val="18"/>
                 <w:rFonts w:eastAsia="맑은 고딕"/>
               </w:rPr>
-              <w:t>모바일 18.9초 / 데스크톱 3.6초</w:t>
+              <w:t>모바일 8.1초 / 데스크톱 1.6초</w:t>
             </w:r>
           </w:p>
         </w:tc>
@@ -5985,7 +5985,7 @@
                 <w:sz w:val="18"/>
                 <w:rFonts w:eastAsia="맑은 고딕"/>
               </w:rPr>
-              <w:t>미달 — 초기 자바스크립트 전송량이 원인. 개선 과제로 등록</w:t>
+              <w:t>데스크톱 충족. 모바일 미달 — 원인 규명 완료(첫 화면 본문이 뒤늦게 끼워지는 구조), 개선 반영 예정</w:t>
             </w:r>
           </w:p>
         </w:tc>
@@ -6004,7 +6004,7 @@
                 <w:sz w:val="18"/>
                 <w:rFonts w:eastAsia="맑은 고딕"/>
               </w:rPr>
-              <w:t>입력 반응성 (FID → TBT 대체)</w:t>
+              <w:t>CLS (레이아웃 안정성)</w:t>
             </w:r>
           </w:p>
         </w:tc>
@@ -6021,7 +6021,7 @@
                 <w:sz w:val="18"/>
                 <w:rFonts w:eastAsia="맑은 고딕"/>
               </w:rPr>
-              <w:t>TBT 200ms 이하</w:t>
+              <w:t>0.1 이하</w:t>
             </w:r>
           </w:p>
         </w:tc>
@@ -6038,7 +6038,7 @@
                 <w:sz w:val="18"/>
                 <w:rFonts w:eastAsia="맑은 고딕"/>
               </w:rPr>
-              <w:t>모바일 382ms / 데스크톱 88ms</w:t>
+              <w:t>모바일 0.971 / 데스크톱 0.007</w:t>
             </w:r>
           </w:p>
         </w:tc>
@@ -6055,7 +6055,7 @@
                 <w:sz w:val="18"/>
                 <w:rFonts w:eastAsia="맑은 고딕"/>
               </w:rPr>
-              <w:t>FID 는 폐지된 지표로 총 차단 시간(TBT)으로 대체 측정</w:t>
+              <w:t>데스크톱 충족. 모바일 미달 — 본문 도착 시 꼬리말이 밀려남. 위와 동일 원인</w:t>
             </w:r>
           </w:p>
         </w:tc>
@@ -6074,7 +6074,7 @@
                 <w:sz w:val="18"/>
                 <w:rFonts w:eastAsia="맑은 고딕"/>
               </w:rPr>
-              <w:t>CLS (레이아웃 안정성)</w:t>
+              <w:t>입력 반응성 (FID → TBT 대체)</w:t>
             </w:r>
           </w:p>
         </w:tc>
@@ -6091,7 +6091,7 @@
                 <w:sz w:val="18"/>
                 <w:rFonts w:eastAsia="맑은 고딕"/>
               </w:rPr>
-              <w:t>0.1 이하</w:t>
+              <w:t>TBT 200ms 이하</w:t>
             </w:r>
           </w:p>
         </w:tc>
@@ -6108,7 +6108,7 @@
                 <w:sz w:val="18"/>
                 <w:rFonts w:eastAsia="맑은 고딕"/>
               </w:rPr>
-              <w:t>모바일 0.045 / 데스크톱 0.006</w:t>
+              <w:t>모바일 213ms / 데스크톱 0ms</w:t>
             </w:r>
           </w:p>
         </w:tc>
@@ -6125,7 +6125,7 @@
                 <w:sz w:val="18"/>
                 <w:rFonts w:eastAsia="맑은 고딕"/>
               </w:rPr>
-              <w:t>충족</w:t>
+              <w:t>FID 는 폐지된 지표로 총 차단 시간(TBT)으로 대체 측정</w:t>
             </w:r>
           </w:p>
         </w:tc>
@@ -7278,7 +7278,7 @@
                 <w:sz w:val="18"/>
                 <w:rFonts w:eastAsia="맑은 고딕"/>
               </w:rPr>
-              <w:t>2026-08-19 실측 — LCP 미달, 그 외 충족</w:t>
+              <w:t>2026-08-20 실측. 데스크톱 91점 전 항목 충족, 모바일 LCP·CLS 미달</w:t>
             </w:r>
           </w:p>
         </w:tc>

</xml_diff>

<commit_message>
chore: 작업 자동 저장 (2026-08-20 11:30)
</commit_message>
<xml_diff>
--- a/docs/government-project/08_테스트결과서.docx
+++ b/docs/government-project/08_테스트결과서.docx
@@ -6287,7 +6287,7 @@
           <w:sz w:val="18"/>
           <w:szCs w:val="18"/>
         </w:rPr>
-        <w:t>Lighthouse 12.8.2 실측(2026. 8. 20., https://healwith.co.kr/ko). 모바일은 저속 4G·CPU 4배 감속 조건이다. 측정 PC 에 설치된 광고차단 프로그램이 페이지마다 2.1MB 를 끼워 넣어 값을 왜곡시키므로 해당 주입을 차단하고 측정하였다. 종합 성능 점수는 모바일 37점, 데스크톱 91점이다.</w:t>
+        <w:t>Lighthouse 12.8.2 실측(2026. 8. 20., https://healwith.co.kr/ko). 모바일은 저속 4G·CPU 4배 감속 조건이다. 측정 PC 에 설치된 광고차단 프로그램이 페이지마다 2.1MB 를 끼워 넣어 값을 왜곡시키므로 해당 주입을 차단하고 측정하였다. 종합 점수는 측정 환경에 따라 편차가 크므로 기재하지 않고, 지표값만 기재한다.</w:t>
       </w:r>
     </w:p>
     <w:p>
@@ -7278,7 +7278,7 @@
                 <w:sz w:val="18"/>
                 <w:rFonts w:eastAsia="맑은 고딕"/>
               </w:rPr>
-              <w:t>2026-08-20 실측. 데스크톱 91점 전 항목 충족, 모바일 LCP·CLS 미달</w:t>
+              <w:t>2026-08-20 실측. 데스크톱 전 항목 충족, 모바일 LCP·CLS 미달</w:t>
             </w:r>
           </w:p>
         </w:tc>

</xml_diff>

<commit_message>
chore: 작업 자동 저장 (2026-08-20 12:04)
</commit_message>
<xml_diff>
--- a/docs/government-project/08_테스트결과서.docx
+++ b/docs/government-project/08_테스트결과서.docx
@@ -5968,7 +5968,7 @@
                 <w:sz w:val="18"/>
                 <w:rFonts w:eastAsia="맑은 고딕"/>
               </w:rPr>
-              <w:t>모바일 6.4초 / 데스크톱 1.5초</w:t>
+              <w:t>모바일 6.4초(5회 중앙값) / 데스크톱 1.5초</w:t>
             </w:r>
           </w:p>
         </w:tc>
@@ -6038,7 +6038,7 @@
                 <w:sz w:val="18"/>
                 <w:rFonts w:eastAsia="맑은 고딕"/>
               </w:rPr>
-              <w:t>모바일 0.95 / 데스크톱 0.51</w:t>
+              <w:t>평상시 0.04 / 발생 시 0.95</w:t>
             </w:r>
           </w:p>
         </w:tc>
@@ -6055,7 +6055,7 @@
                 <w:sz w:val="18"/>
                 <w:rFonts w:eastAsia="맑은 고딕"/>
               </w:rPr>
-              <w:t>양쪽 미달. 첫 화면 본문이 뒤늦게 끼워지며 꼬리말이 밀린다. 원인 규명 완료, 수정 반영 예정</w:t>
+              <w:t>5회 반복 측정 중 1회 발생. 화면 골격이 본문보다 먼저 그려진 회차에서만 꼬리말이 밀린다. 원인 규명 완료, 수정 반영 예정</w:t>
             </w:r>
           </w:p>
         </w:tc>
@@ -6287,7 +6287,7 @@
           <w:sz w:val="18"/>
           <w:szCs w:val="18"/>
         </w:rPr>
-        <w:t>Lighthouse 12.8.2 실측(2026. 8. 20., https://healwith.co.kr/ko). 모바일은 저속 4G·CPU 4배 감속 조건이다. 측정 PC 의 광고차단 프로그램이 값을 왜곡시키므로 해당 프로그램을 끈 상태에서 측정하였다. 종합 점수는 측정 환경에 따라 편차가 크므로 기재하지 않고 지표값만 기재한다.</w:t>
+        <w:t>Lighthouse 12.8.2 실측(2026. 8. 20., https://healwith.co.kr/ko). 모바일은 저속 4G·CPU 4배 감속 조건이며 5회 반복 측정의 중앙값이다. 측정 PC 의 광고차단 프로그램이 값을 왜곡시키므로 해당 프로그램을 끈 상태에서 측정하였다. 종합 점수는 측정 환경에 따라 편차가 크므로 기재하지 않고 지표값만 기재한다.</w:t>
       </w:r>
     </w:p>
     <w:p>
@@ -7278,7 +7278,7 @@
                 <w:sz w:val="18"/>
                 <w:rFonts w:eastAsia="맑은 고딕"/>
               </w:rPr>
-              <w:t>2026-08-20 실측. LCP 는 데스크톱만 충족, CLS 는 양쪽 미달(원인 규명 완료)</w:t>
+              <w:t>2026-08-20 실측(5회 반복). LCP 는 데스크톱만 충족, CLS 는 간헐 발생(원인 규명 완료)</w:t>
             </w:r>
           </w:p>
         </w:tc>

</xml_diff>

<commit_message>
chore: 작업 자동 저장 (2026-08-20 12:23)
</commit_message>
<xml_diff>
--- a/docs/government-project/08_테스트결과서.docx
+++ b/docs/government-project/08_테스트결과서.docx
@@ -5968,7 +5968,7 @@
                 <w:sz w:val="18"/>
                 <w:rFonts w:eastAsia="맑은 고딕"/>
               </w:rPr>
-              <w:t>모바일 6.4초(5회 중앙값) / 데스크톱 1.5초</w:t>
+              <w:t>모바일 6.40초 / 데스크톱 1.41초</w:t>
             </w:r>
           </w:p>
         </w:tc>
@@ -5985,7 +5985,7 @@
                 <w:sz w:val="18"/>
                 <w:rFonts w:eastAsia="맑은 고딕"/>
               </w:rPr>
-              <w:t>데스크톱 충족. 모바일 미달(첫 화면 전송량 831KB 가 저속 회선에서 병목). 개선 과제</w:t>
+              <w:t>각 5회 반복 측정의 중앙값. 데스크톱 충족, 모바일 미달(첫 화면 전송량 831KB 가 저속 회선에서 병목). 개선 과제</w:t>
             </w:r>
           </w:p>
         </w:tc>
@@ -6038,7 +6038,7 @@
                 <w:sz w:val="18"/>
                 <w:rFonts w:eastAsia="맑은 고딕"/>
               </w:rPr>
-              <w:t>평상시 0.04 / 발생 시 0.95</w:t>
+              <w:t>데스크톱 0.51(5회 중 4회) / 모바일 0.95(5회 중 1회)</w:t>
             </w:r>
           </w:p>
         </w:tc>
@@ -6055,7 +6055,7 @@
                 <w:sz w:val="18"/>
                 <w:rFonts w:eastAsia="맑은 고딕"/>
               </w:rPr>
-              <w:t>5회 반복 측정 중 1회 발생. 화면 골격이 본문보다 먼저 그려진 회차에서만 꼬리말이 밀린다. 원인 규명 완료, 수정 반영 예정</w:t>
+              <w:t>간헐 발생. 화면 골격이 본문보다 먼저 그려진 회차에서만 꼬리말이 밀린다. 원인 규명 완료, 수정 반영 예정</w:t>
             </w:r>
           </w:p>
         </w:tc>
@@ -6108,7 +6108,7 @@
                 <w:sz w:val="18"/>
                 <w:rFonts w:eastAsia="맑은 고딕"/>
               </w:rPr>
-              <w:t>모바일 388ms / 데스크톱 28ms</w:t>
+              <w:t>모바일 186ms / 데스크톱 25ms</w:t>
             </w:r>
           </w:p>
         </w:tc>
@@ -6125,7 +6125,7 @@
                 <w:sz w:val="18"/>
                 <w:rFonts w:eastAsia="맑은 고딕"/>
               </w:rPr>
-              <w:t>FID 는 폐지된 지표로 총 차단 시간(TBT)으로 대체 측정</w:t>
+              <w:t>각 5회 중앙값. FID 는 폐지된 지표로 총 차단 시간(TBT)으로 대체 측정. 양쪽 충족</w:t>
             </w:r>
           </w:p>
         </w:tc>
@@ -7278,7 +7278,7 @@
                 <w:sz w:val="18"/>
                 <w:rFonts w:eastAsia="맑은 고딕"/>
               </w:rPr>
-              <w:t>2026-08-20 실측(5회 반복). LCP 는 데스크톱만 충족, CLS 는 간헐 발생(원인 규명 완료)</w:t>
+              <w:t>2026-08-20 실측(모바일·데스크톱 각 5회). LCP 는 데스크톱만 충족, CLS 는 간헐 발생</w:t>
             </w:r>
           </w:p>
         </w:tc>

</xml_diff>